<commit_message>
Finalise internship completion certificate and progress report
- Add the filled Progress_Report.docx (industrial-training progress snapshot)
- Correct internship start date 24 May -> 25 May 2026 in both documents to match
  the attendance sheet and the final report certificate
- Intern-side details complete; remaining certificate blanks (regd. office,
  ref no., seal, HR signatory, performance rating) left for Satia to issue/stamp

Co-Authored-By: Claude Opus 4.8 <noreply@anthropic.com>
</commit_message>
<xml_diff>
--- a/docs/Internship_Completion_Certificate.docx
+++ b/docs/Internship_Completion_Certificate.docx
@@ -185,7 +185,7 @@
           <w:i w:val="0"/>
           <w:sz w:val="24"/>
         </w:rPr>
-        <w:t>__________________________________</w:t>
+        <w:t>Manreet Gill</w:t>
       </w:r>
       <w:r>
         <w:rPr>
@@ -203,7 +203,7 @@
           <w:i w:val="0"/>
           <w:sz w:val="24"/>
         </w:rPr>
-        <w:t>__________________</w:t>
+        <w:t>24BCS10479</w:t>
       </w:r>
       <w:r>
         <w:rPr>
@@ -221,7 +221,7 @@
           <w:i w:val="0"/>
           <w:sz w:val="24"/>
         </w:rPr>
-        <w:t xml:space="preserve"> a student of </w:t>
+        <w:t xml:space="preserve"> a student of the </w:t>
       </w:r>
       <w:r>
         <w:rPr>
@@ -230,7 +230,7 @@
           <w:i w:val="0"/>
           <w:sz w:val="24"/>
         </w:rPr>
-        <w:t>__________________________________</w:t>
+        <w:t>Bachelor of Engineering (Computer Science &amp; Engineering)</w:t>
       </w:r>
       <w:r>
         <w:rPr>
@@ -239,34 +239,7 @@
           <w:i w:val="0"/>
           <w:sz w:val="24"/>
         </w:rPr>
-        <w:t xml:space="preserve"> (Programme / Branch: </w:t>
-      </w:r>
-      <w:r>
-        <w:rPr>
-          <w:rFonts w:ascii="Calibri" w:hAnsi="Calibri"/>
-          <w:b w:val="0"/>
-          <w:i w:val="0"/>
-          <w:sz w:val="24"/>
-        </w:rPr>
-        <w:t>______________________</w:t>
-      </w:r>
-      <w:r>
-        <w:rPr>
-          <w:rFonts w:ascii="Calibri" w:hAnsi="Calibri"/>
-          <w:b w:val="0"/>
-          <w:i w:val="0"/>
-          <w:sz w:val="24"/>
-        </w:rPr>
-        <w:t>)</w:t>
-      </w:r>
-      <w:r>
-        <w:rPr>
-          <w:rFonts w:ascii="Calibri" w:hAnsi="Calibri"/>
-          <w:b w:val="0"/>
-          <w:i w:val="0"/>
-          <w:sz w:val="24"/>
-        </w:rPr>
-        <w:t xml:space="preserve"> at Chandigarh University, has successfully completed his/her industrial training / internship at Satia Industries Limited.</w:t>
+        <w:t xml:space="preserve"> programme, Department of Computer Science &amp; Engineering, Chandigarh University, has successfully completed his/her industrial training / internship at Satia Industries Limited.</w:t>
       </w:r>
     </w:p>
     <w:p>
@@ -281,7 +254,7 @@
           <w:i w:val="0"/>
           <w:sz w:val="24"/>
         </w:rPr>
-        <w:t xml:space="preserve">The internship was carried out from </w:t>
+        <w:t>The internship was carried out from 25 May 2026 to 10 July 2026 in the Information Technology (IT) department, during which the intern worked on the project titled “Smart Paper Mill Production Monitoring Dashboard”.</w:t>
       </w:r>
       <w:r>
         <w:rPr>
@@ -290,7 +263,6 @@
           <w:i w:val="0"/>
           <w:sz w:val="24"/>
         </w:rPr>
-        <w:t>__________________</w:t>
       </w:r>
       <w:r>
         <w:rPr>
@@ -299,7 +271,6 @@
           <w:i w:val="0"/>
           <w:sz w:val="24"/>
         </w:rPr>
-        <w:t xml:space="preserve"> to </w:t>
       </w:r>
       <w:r>
         <w:rPr>
@@ -308,7 +279,6 @@
           <w:i w:val="0"/>
           <w:sz w:val="24"/>
         </w:rPr>
-        <w:t>__________________</w:t>
       </w:r>
       <w:r>
         <w:rPr>
@@ -317,7 +287,14 @@
           <w:i w:val="0"/>
           <w:sz w:val="24"/>
         </w:rPr>
-        <w:t xml:space="preserve"> in the </w:t>
+      </w:r>
+      <w:r>
+        <w:rPr>
+          <w:rFonts w:ascii="Calibri" w:hAnsi="Calibri"/>
+          <w:b/>
+          <w:i w:val="0"/>
+          <w:sz w:val="24"/>
+        </w:rPr>
       </w:r>
       <w:r>
         <w:rPr>
@@ -326,7 +303,14 @@
           <w:i w:val="0"/>
           <w:sz w:val="24"/>
         </w:rPr>
-        <w:t>______________________</w:t>
+      </w:r>
+      <w:r>
+        <w:rPr>
+          <w:rFonts w:ascii="Calibri" w:hAnsi="Calibri"/>
+          <w:b/>
+          <w:i/>
+          <w:sz w:val="24"/>
+        </w:rPr>
       </w:r>
       <w:r>
         <w:rPr>
@@ -335,25 +319,6 @@
           <w:i w:val="0"/>
           <w:sz w:val="24"/>
         </w:rPr>
-        <w:t xml:space="preserve"> department, during which the intern worked on the project titled </w:t>
-      </w:r>
-      <w:r>
-        <w:rPr>
-          <w:rFonts w:ascii="Calibri" w:hAnsi="Calibri"/>
-          <w:b/>
-          <w:i/>
-          <w:sz w:val="24"/>
-        </w:rPr>
-        <w:t>“Smart Paper Mill Production Monitoring Dashboard”</w:t>
-      </w:r>
-      <w:r>
-        <w:rPr>
-          <w:rFonts w:ascii="Calibri" w:hAnsi="Calibri"/>
-          <w:b w:val="0"/>
-          <w:i w:val="0"/>
-          <w:sz w:val="24"/>
-        </w:rPr>
-        <w:t>.</w:t>
       </w:r>
     </w:p>
     <w:p>
@@ -503,11 +468,11 @@
             <w:r>
               <w:rPr>
                 <w:rFonts w:ascii="Calibri" w:hAnsi="Calibri"/>
-                <w:b w:val="0"/>
+                <w:b/>
                 <w:i w:val="0"/>
                 <w:sz w:val="21"/>
               </w:rPr>
-              <w:t>Name: __________________</w:t>
+              <w:t>Name: Mr. Surinder Mehra</w:t>
             </w:r>
           </w:p>
           <w:p>
@@ -517,11 +482,11 @@
             <w:r>
               <w:rPr>
                 <w:rFonts w:ascii="Calibri" w:hAnsi="Calibri"/>
-                <w:b w:val="0"/>
+                <w:b/>
                 <w:i w:val="0"/>
                 <w:sz w:val="21"/>
               </w:rPr>
-              <w:t>Designation: ____________</w:t>
+              <w:t>Designation: IT Head, Satia Industries Ltd.</w:t>
             </w:r>
           </w:p>
           <w:p>

</xml_diff>